<commit_message>
Update Participants Handbook and Problem Statements.docx
</commit_message>
<xml_diff>
--- a/Doc/Participants Handbook and Problem Statements.docx
+++ b/Doc/Participants Handbook and Problem Statements.docx
@@ -3613,8 +3613,234 @@
     </w:tbl>
     <w:p>
       <w:pPr>
+        <w:pStyle w:val="ListParagraph"/>
         <w:spacing w:after="20"/>
       </w:pPr>
+    </w:p>
+    <w:p>
+      <w:pPr>
+        <w:pStyle w:val="ListParagraph"/>
+        <w:spacing w:after="20"/>
+      </w:pPr>
+    </w:p>
+    <w:p>
+      <w:pPr>
+        <w:pStyle w:val="ListParagraph"/>
+        <w:spacing w:after="20"/>
+        <w:rPr>
+          <w:sz w:val="44"/>
+          <w:szCs w:val="44"/>
+        </w:rPr>
+      </w:pPr>
+      <w:r>
+        <w:rPr>
+          <w:sz w:val="44"/>
+          <w:szCs w:val="44"/>
+        </w:rPr>
+        <w:t xml:space="preserve">SPONDERS IS </w:t>
+      </w:r>
+    </w:p>
+    <w:p>
+      <w:pPr>
+        <w:pStyle w:val="ListParagraph"/>
+        <w:numPr>
+          <w:ilvl w:val="0"/>
+          <w:numId w:val="3"/>
+        </w:numPr>
+        <w:spacing w:after="20"/>
+      </w:pPr>
+      <w:r>
+        <w:t>NOAH AI</w:t>
+      </w:r>
+    </w:p>
+    <w:p>
+      <w:pPr>
+        <w:pStyle w:val="ListParagraph"/>
+        <w:numPr>
+          <w:ilvl w:val="0"/>
+          <w:numId w:val="3"/>
+        </w:numPr>
+        <w:spacing w:after="20"/>
+      </w:pPr>
+      <w:r>
+        <w:t>Zerion</w:t>
+      </w:r>
+    </w:p>
+    <w:p>
+      <w:pPr>
+        <w:pStyle w:val="ListParagraph"/>
+        <w:numPr>
+          <w:ilvl w:val="0"/>
+          <w:numId w:val="3"/>
+        </w:numPr>
+        <w:spacing w:after="20"/>
+      </w:pPr>
+      <w:r>
+        <w:t>GitHub</w:t>
+      </w:r>
+    </w:p>
+    <w:p>
+      <w:pPr>
+        <w:pStyle w:val="ListParagraph"/>
+        <w:numPr>
+          <w:ilvl w:val="0"/>
+          <w:numId w:val="3"/>
+        </w:numPr>
+        <w:spacing w:after="20"/>
+      </w:pPr>
+      <w:r>
+        <w:t>Algorand</w:t>
+      </w:r>
+    </w:p>
+    <w:p>
+      <w:pPr>
+        <w:pStyle w:val="ListParagraph"/>
+        <w:numPr>
+          <w:ilvl w:val="0"/>
+          <w:numId w:val="3"/>
+        </w:numPr>
+        <w:spacing w:after="20"/>
+      </w:pPr>
+      <w:r>
+        <w:t xml:space="preserve">RoboKiden </w:t>
+      </w:r>
+    </w:p>
+    <w:p>
+      <w:pPr>
+        <w:spacing w:after="20"/>
+      </w:pPr>
+    </w:p>
+    <w:p>
+      <w:pPr>
+        <w:spacing w:after="20"/>
+      </w:pPr>
+    </w:p>
+    <w:p>
+      <w:pPr>
+        <w:spacing w:after="20"/>
+      </w:pPr>
+    </w:p>
+    <w:p>
+      <w:pPr>
+        <w:spacing w:after="20"/>
+      </w:pPr>
+    </w:p>
+    <w:p>
+      <w:pPr>
+        <w:spacing w:after="20"/>
+      </w:pPr>
+    </w:p>
+    <w:p>
+      <w:pPr>
+        <w:spacing w:after="20"/>
+      </w:pPr>
+      <w:r>
+        <w:t>We will be using the best use of sponsors products and services to maximize the chance of winning</w:t>
+      </w:r>
+    </w:p>
+    <w:p>
+      <w:pPr>
+        <w:spacing w:after="20"/>
+      </w:pPr>
+      <w:r>
+        <w:br/>
+      </w:r>
+      <w:r>
+        <w:br/>
+      </w:r>
+      <w:r>
+        <w:br/>
+      </w:r>
+      <w:r>
+        <w:br/>
+      </w:r>
+      <w:r>
+        <w:br/>
+      </w:r>
+      <w:r>
+        <w:br/>
+      </w:r>
+      <w:r>
+        <w:br/>
+      </w:r>
+      <w:r>
+        <w:lastRenderedPageBreak/>
+        <w:br/>
+        <w:t xml:space="preserve">cautions: </w:t>
+      </w:r>
+      <w:r>
+        <w:br/>
+      </w:r>
+      <w:r>
+        <w:br/>
+        <w:t>commit to git step wise and detailed, do not commit 1000s of lines at once</w:t>
+      </w:r>
+      <w:r>
+        <w:br/>
+      </w:r>
+      <w:r>
+        <w:br/>
+      </w:r>
+      <w:r>
+        <w:br/>
+        <w:t xml:space="preserve">for Mobile application: </w:t>
+      </w:r>
+      <w:r>
+        <w:br/>
+        <w:t xml:space="preserve">we are using Flutter + firebase with google oath, </w:t>
+      </w:r>
+      <w:r>
+        <w:br/>
+      </w:r>
+      <w:r>
+        <w:br/>
+      </w:r>
+      <w:r>
+        <w:br/>
+        <w:t xml:space="preserve">For deployment: </w:t>
+      </w:r>
+      <w:r>
+        <w:br/>
+        <w:t xml:space="preserve">we are using Verel, </w:t>
+      </w:r>
+      <w:r>
+        <w:br/>
+      </w:r>
+      <w:r>
+        <w:br/>
+        <w:t xml:space="preserve">Website: fully working, connected to app </w:t>
+      </w:r>
+      <w:r>
+        <w:br/>
+      </w:r>
+      <w:r>
+        <w:br/>
+      </w:r>
+      <w:r>
+        <w:br/>
+        <w:t xml:space="preserve">For Subscription </w:t>
+      </w:r>
+      <w:r>
+        <w:br/>
+        <w:t>we will provide</w:t>
+      </w:r>
+      <w:r>
+        <w:br/>
+        <w:t>1. Subscription plan (</w:t>
+      </w:r>
+      <w:proofErr w:type="gramStart"/>
+      <w:r>
+        <w:t>free,-</w:t>
+      </w:r>
+      <w:proofErr w:type="gramEnd"/>
+      <w:r>
+        <w:t xml:space="preserve"> take a small cut per transaction, pro – YOU THINK, ProMax – unlimited payments </w:t>
+      </w:r>
+      <w:proofErr w:type="gramStart"/>
+      <w:r>
+        <w:t>no )</w:t>
+      </w:r>
+      <w:proofErr w:type="gramEnd"/>
     </w:p>
     <w:sectPr>
       <w:headerReference w:type="default" r:id="rId8"/>
@@ -4129,6 +4355,92 @@
     </w:lvl>
   </w:abstractNum>
   <w:abstractNum w:abstractNumId="21" w15:restartNumberingAfterBreak="0">
+    <w:nsid w:val="40542A5F"/>
+    <w:multiLevelType w:val="hybridMultilevel"/>
+    <w:tmpl w:val="601C85CC"/>
+    <w:lvl w:ilvl="0" w:tplc="0409000F">
+      <w:start w:val="1"/>
+      <w:numFmt w:val="decimal"/>
+      <w:lvlText w:val="%1."/>
+      <w:lvlJc w:val="left"/>
+      <w:pPr>
+        <w:ind w:left="720" w:hanging="360"/>
+      </w:pPr>
+    </w:lvl>
+    <w:lvl w:ilvl="1" w:tplc="04090019" w:tentative="1">
+      <w:start w:val="1"/>
+      <w:numFmt w:val="lowerLetter"/>
+      <w:lvlText w:val="%2."/>
+      <w:lvlJc w:val="left"/>
+      <w:pPr>
+        <w:ind w:left="1440" w:hanging="360"/>
+      </w:pPr>
+    </w:lvl>
+    <w:lvl w:ilvl="2" w:tplc="0409001B" w:tentative="1">
+      <w:start w:val="1"/>
+      <w:numFmt w:val="lowerRoman"/>
+      <w:lvlText w:val="%3."/>
+      <w:lvlJc w:val="right"/>
+      <w:pPr>
+        <w:ind w:left="2160" w:hanging="180"/>
+      </w:pPr>
+    </w:lvl>
+    <w:lvl w:ilvl="3" w:tplc="0409000F" w:tentative="1">
+      <w:start w:val="1"/>
+      <w:numFmt w:val="decimal"/>
+      <w:lvlText w:val="%4."/>
+      <w:lvlJc w:val="left"/>
+      <w:pPr>
+        <w:ind w:left="2880" w:hanging="360"/>
+      </w:pPr>
+    </w:lvl>
+    <w:lvl w:ilvl="4" w:tplc="04090019" w:tentative="1">
+      <w:start w:val="1"/>
+      <w:numFmt w:val="lowerLetter"/>
+      <w:lvlText w:val="%5."/>
+      <w:lvlJc w:val="left"/>
+      <w:pPr>
+        <w:ind w:left="3600" w:hanging="360"/>
+      </w:pPr>
+    </w:lvl>
+    <w:lvl w:ilvl="5" w:tplc="0409001B" w:tentative="1">
+      <w:start w:val="1"/>
+      <w:numFmt w:val="lowerRoman"/>
+      <w:lvlText w:val="%6."/>
+      <w:lvlJc w:val="right"/>
+      <w:pPr>
+        <w:ind w:left="4320" w:hanging="180"/>
+      </w:pPr>
+    </w:lvl>
+    <w:lvl w:ilvl="6" w:tplc="0409000F" w:tentative="1">
+      <w:start w:val="1"/>
+      <w:numFmt w:val="decimal"/>
+      <w:lvlText w:val="%7."/>
+      <w:lvlJc w:val="left"/>
+      <w:pPr>
+        <w:ind w:left="5040" w:hanging="360"/>
+      </w:pPr>
+    </w:lvl>
+    <w:lvl w:ilvl="7" w:tplc="04090019" w:tentative="1">
+      <w:start w:val="1"/>
+      <w:numFmt w:val="lowerLetter"/>
+      <w:lvlText w:val="%8."/>
+      <w:lvlJc w:val="left"/>
+      <w:pPr>
+        <w:ind w:left="5760" w:hanging="360"/>
+      </w:pPr>
+    </w:lvl>
+    <w:lvl w:ilvl="8" w:tplc="0409001B" w:tentative="1">
+      <w:start w:val="1"/>
+      <w:numFmt w:val="lowerRoman"/>
+      <w:lvlText w:val="%9."/>
+      <w:lvlJc w:val="right"/>
+      <w:pPr>
+        <w:ind w:left="6480" w:hanging="180"/>
+      </w:pPr>
+    </w:lvl>
+  </w:abstractNum>
+  <w:abstractNum w:abstractNumId="22" w15:restartNumberingAfterBreak="0">
     <w:nsid w:val="412A320B"/>
     <w:multiLevelType w:val="singleLevel"/>
     <w:tmpl w:val="3D64A6B2"/>
@@ -4142,7 +4454,7 @@
       </w:pPr>
     </w:lvl>
   </w:abstractNum>
-  <w:abstractNum w:abstractNumId="22" w15:restartNumberingAfterBreak="0">
+  <w:abstractNum w:abstractNumId="23" w15:restartNumberingAfterBreak="0">
     <w:nsid w:val="434C73D8"/>
     <w:multiLevelType w:val="singleLevel"/>
     <w:tmpl w:val="CC64A6CC"/>
@@ -4156,7 +4468,7 @@
       </w:pPr>
     </w:lvl>
   </w:abstractNum>
-  <w:abstractNum w:abstractNumId="23" w15:restartNumberingAfterBreak="0">
+  <w:abstractNum w:abstractNumId="24" w15:restartNumberingAfterBreak="0">
     <w:nsid w:val="477A56C8"/>
     <w:multiLevelType w:val="singleLevel"/>
     <w:tmpl w:val="02EC6DE2"/>
@@ -4170,7 +4482,7 @@
       </w:pPr>
     </w:lvl>
   </w:abstractNum>
-  <w:abstractNum w:abstractNumId="24" w15:restartNumberingAfterBreak="0">
+  <w:abstractNum w:abstractNumId="25" w15:restartNumberingAfterBreak="0">
     <w:nsid w:val="490C247F"/>
     <w:multiLevelType w:val="singleLevel"/>
     <w:tmpl w:val="C34CBC66"/>
@@ -4184,7 +4496,7 @@
       </w:pPr>
     </w:lvl>
   </w:abstractNum>
-  <w:abstractNum w:abstractNumId="25" w15:restartNumberingAfterBreak="0">
+  <w:abstractNum w:abstractNumId="26" w15:restartNumberingAfterBreak="0">
     <w:nsid w:val="497B3DAB"/>
     <w:multiLevelType w:val="singleLevel"/>
     <w:tmpl w:val="2CFAF6CE"/>
@@ -4198,7 +4510,7 @@
       </w:pPr>
     </w:lvl>
   </w:abstractNum>
-  <w:abstractNum w:abstractNumId="26" w15:restartNumberingAfterBreak="0">
+  <w:abstractNum w:abstractNumId="27" w15:restartNumberingAfterBreak="0">
     <w:nsid w:val="4BD15D9D"/>
     <w:multiLevelType w:val="singleLevel"/>
     <w:tmpl w:val="4C62A69C"/>
@@ -4212,7 +4524,7 @@
       </w:pPr>
     </w:lvl>
   </w:abstractNum>
-  <w:abstractNum w:abstractNumId="27" w15:restartNumberingAfterBreak="0">
+  <w:abstractNum w:abstractNumId="28" w15:restartNumberingAfterBreak="0">
     <w:nsid w:val="4C4C4950"/>
     <w:multiLevelType w:val="singleLevel"/>
     <w:tmpl w:val="A2D0B456"/>
@@ -4226,7 +4538,7 @@
       </w:pPr>
     </w:lvl>
   </w:abstractNum>
-  <w:abstractNum w:abstractNumId="28" w15:restartNumberingAfterBreak="0">
+  <w:abstractNum w:abstractNumId="29" w15:restartNumberingAfterBreak="0">
     <w:nsid w:val="56F54500"/>
     <w:multiLevelType w:val="singleLevel"/>
     <w:tmpl w:val="C0BC6506"/>
@@ -4240,7 +4552,7 @@
       </w:pPr>
     </w:lvl>
   </w:abstractNum>
-  <w:abstractNum w:abstractNumId="29" w15:restartNumberingAfterBreak="0">
+  <w:abstractNum w:abstractNumId="30" w15:restartNumberingAfterBreak="0">
     <w:nsid w:val="5960086F"/>
     <w:multiLevelType w:val="singleLevel"/>
     <w:tmpl w:val="77149B14"/>
@@ -4254,7 +4566,7 @@
       </w:pPr>
     </w:lvl>
   </w:abstractNum>
-  <w:abstractNum w:abstractNumId="30" w15:restartNumberingAfterBreak="0">
+  <w:abstractNum w:abstractNumId="31" w15:restartNumberingAfterBreak="0">
     <w:nsid w:val="5AAD62AA"/>
     <w:multiLevelType w:val="singleLevel"/>
     <w:tmpl w:val="B0EA70CA"/>
@@ -4268,7 +4580,7 @@
       </w:pPr>
     </w:lvl>
   </w:abstractNum>
-  <w:abstractNum w:abstractNumId="31" w15:restartNumberingAfterBreak="0">
+  <w:abstractNum w:abstractNumId="32" w15:restartNumberingAfterBreak="0">
     <w:nsid w:val="5C0627AB"/>
     <w:multiLevelType w:val="singleLevel"/>
     <w:tmpl w:val="F2F8BBA6"/>
@@ -4282,7 +4594,7 @@
       </w:pPr>
     </w:lvl>
   </w:abstractNum>
-  <w:abstractNum w:abstractNumId="32" w15:restartNumberingAfterBreak="0">
+  <w:abstractNum w:abstractNumId="33" w15:restartNumberingAfterBreak="0">
     <w:nsid w:val="601B28E5"/>
     <w:multiLevelType w:val="singleLevel"/>
     <w:tmpl w:val="26085DD4"/>
@@ -4296,7 +4608,7 @@
       </w:pPr>
     </w:lvl>
   </w:abstractNum>
-  <w:abstractNum w:abstractNumId="33" w15:restartNumberingAfterBreak="0">
+  <w:abstractNum w:abstractNumId="34" w15:restartNumberingAfterBreak="0">
     <w:nsid w:val="64BD6FE6"/>
     <w:multiLevelType w:val="singleLevel"/>
     <w:tmpl w:val="30E429AE"/>
@@ -4310,7 +4622,96 @@
       </w:pPr>
     </w:lvl>
   </w:abstractNum>
-  <w:abstractNum w:abstractNumId="34" w15:restartNumberingAfterBreak="0">
+  <w:abstractNum w:abstractNumId="35" w15:restartNumberingAfterBreak="0">
+    <w:nsid w:val="66631DED"/>
+    <w:multiLevelType w:val="hybridMultilevel"/>
+    <w:tmpl w:val="188037CA"/>
+    <w:lvl w:ilvl="0" w:tplc="04090001">
+      <w:start w:val="1"/>
+      <w:numFmt w:val="bullet"/>
+      <w:lvlText w:val=""/>
+      <w:lvlJc w:val="left"/>
+      <w:pPr>
+        <w:ind w:left="720" w:hanging="360"/>
+      </w:pPr>
+      <w:rPr>
+        <w:rFonts w:ascii="Symbol" w:hAnsi="Symbol" w:hint="default"/>
+      </w:rPr>
+    </w:lvl>
+    <w:lvl w:ilvl="1" w:tplc="FFFFFFFF" w:tentative="1">
+      <w:start w:val="1"/>
+      <w:numFmt w:val="lowerLetter"/>
+      <w:lvlText w:val="%2."/>
+      <w:lvlJc w:val="left"/>
+      <w:pPr>
+        <w:ind w:left="1440" w:hanging="360"/>
+      </w:pPr>
+    </w:lvl>
+    <w:lvl w:ilvl="2" w:tplc="FFFFFFFF" w:tentative="1">
+      <w:start w:val="1"/>
+      <w:numFmt w:val="lowerRoman"/>
+      <w:lvlText w:val="%3."/>
+      <w:lvlJc w:val="right"/>
+      <w:pPr>
+        <w:ind w:left="2160" w:hanging="180"/>
+      </w:pPr>
+    </w:lvl>
+    <w:lvl w:ilvl="3" w:tplc="FFFFFFFF" w:tentative="1">
+      <w:start w:val="1"/>
+      <w:numFmt w:val="decimal"/>
+      <w:lvlText w:val="%4."/>
+      <w:lvlJc w:val="left"/>
+      <w:pPr>
+        <w:ind w:left="2880" w:hanging="360"/>
+      </w:pPr>
+    </w:lvl>
+    <w:lvl w:ilvl="4" w:tplc="FFFFFFFF" w:tentative="1">
+      <w:start w:val="1"/>
+      <w:numFmt w:val="lowerLetter"/>
+      <w:lvlText w:val="%5."/>
+      <w:lvlJc w:val="left"/>
+      <w:pPr>
+        <w:ind w:left="3600" w:hanging="360"/>
+      </w:pPr>
+    </w:lvl>
+    <w:lvl w:ilvl="5" w:tplc="FFFFFFFF" w:tentative="1">
+      <w:start w:val="1"/>
+      <w:numFmt w:val="lowerRoman"/>
+      <w:lvlText w:val="%6."/>
+      <w:lvlJc w:val="right"/>
+      <w:pPr>
+        <w:ind w:left="4320" w:hanging="180"/>
+      </w:pPr>
+    </w:lvl>
+    <w:lvl w:ilvl="6" w:tplc="FFFFFFFF" w:tentative="1">
+      <w:start w:val="1"/>
+      <w:numFmt w:val="decimal"/>
+      <w:lvlText w:val="%7."/>
+      <w:lvlJc w:val="left"/>
+      <w:pPr>
+        <w:ind w:left="5040" w:hanging="360"/>
+      </w:pPr>
+    </w:lvl>
+    <w:lvl w:ilvl="7" w:tplc="FFFFFFFF" w:tentative="1">
+      <w:start w:val="1"/>
+      <w:numFmt w:val="lowerLetter"/>
+      <w:lvlText w:val="%8."/>
+      <w:lvlJc w:val="left"/>
+      <w:pPr>
+        <w:ind w:left="5760" w:hanging="360"/>
+      </w:pPr>
+    </w:lvl>
+    <w:lvl w:ilvl="8" w:tplc="FFFFFFFF" w:tentative="1">
+      <w:start w:val="1"/>
+      <w:numFmt w:val="lowerRoman"/>
+      <w:lvlText w:val="%9."/>
+      <w:lvlJc w:val="right"/>
+      <w:pPr>
+        <w:ind w:left="6480" w:hanging="180"/>
+      </w:pPr>
+    </w:lvl>
+  </w:abstractNum>
+  <w:abstractNum w:abstractNumId="36" w15:restartNumberingAfterBreak="0">
     <w:nsid w:val="6E6D28C6"/>
     <w:multiLevelType w:val="singleLevel"/>
     <w:tmpl w:val="E848BE96"/>
@@ -4324,7 +4725,7 @@
       </w:pPr>
     </w:lvl>
   </w:abstractNum>
-  <w:abstractNum w:abstractNumId="35" w15:restartNumberingAfterBreak="0">
+  <w:abstractNum w:abstractNumId="37" w15:restartNumberingAfterBreak="0">
     <w:nsid w:val="73B81F95"/>
     <w:multiLevelType w:val="singleLevel"/>
     <w:tmpl w:val="95100706"/>
@@ -4338,7 +4739,7 @@
       </w:pPr>
     </w:lvl>
   </w:abstractNum>
-  <w:abstractNum w:abstractNumId="36" w15:restartNumberingAfterBreak="0">
+  <w:abstractNum w:abstractNumId="38" w15:restartNumberingAfterBreak="0">
     <w:nsid w:val="75603C0F"/>
     <w:multiLevelType w:val="singleLevel"/>
     <w:tmpl w:val="74A2F8C6"/>
@@ -4353,7 +4754,7 @@
       </w:pPr>
     </w:lvl>
   </w:abstractNum>
-  <w:abstractNum w:abstractNumId="37" w15:restartNumberingAfterBreak="0">
+  <w:abstractNum w:abstractNumId="39" w15:restartNumberingAfterBreak="0">
     <w:nsid w:val="76601CD8"/>
     <w:multiLevelType w:val="singleLevel"/>
     <w:tmpl w:val="883C08DC"/>
@@ -4367,7 +4768,7 @@
       </w:pPr>
     </w:lvl>
   </w:abstractNum>
-  <w:abstractNum w:abstractNumId="38" w15:restartNumberingAfterBreak="0">
+  <w:abstractNum w:abstractNumId="40" w15:restartNumberingAfterBreak="0">
     <w:nsid w:val="776364C4"/>
     <w:multiLevelType w:val="singleLevel"/>
     <w:tmpl w:val="EF50821C"/>
@@ -4381,7 +4782,7 @@
       </w:pPr>
     </w:lvl>
   </w:abstractNum>
-  <w:abstractNum w:abstractNumId="39" w15:restartNumberingAfterBreak="0">
+  <w:abstractNum w:abstractNumId="41" w15:restartNumberingAfterBreak="0">
     <w:nsid w:val="7E5852DA"/>
     <w:multiLevelType w:val="singleLevel"/>
     <w:tmpl w:val="91B0ABF4"/>
@@ -4396,7 +4797,13 @@
     </w:lvl>
   </w:abstractNum>
   <w:num w:numId="1" w16cid:durableId="679619397">
-    <w:abstractNumId w:val="36"/>
+    <w:abstractNumId w:val="38"/>
+  </w:num>
+  <w:num w:numId="2" w16cid:durableId="1691224015">
+    <w:abstractNumId w:val="21"/>
+  </w:num>
+  <w:num w:numId="3" w16cid:durableId="1222867679">
+    <w:abstractNumId w:val="35"/>
   </w:num>
 </w:numbering>
 </file>

</xml_diff>